<commit_message>
feat: LLM temperature, L1.5 escalation rules, debug chat, DOCX support
- LLM temperature slider in bot settings (config, llm_settings, engine, UI)
- Escalation rules (L1.5): per-reason QA pairs + keyword patterns for forced escalation
- Debug chat modal on settings page with full pipeline trace
- DOCX export: added escalation_rules section
- DOCX import: parse escalation_rules (L1.5) from docx
- Template DOCX updated with new section
- 14/14 tests pass
</commit_message>
<xml_diff>
--- a/templates/Шаблон причины обращения.docx
+++ b/templates/Шаблон причины обращения.docx
@@ -4,176 +4,109 @@
   <w:body>
     <w:p>
       <w:r>
-        <w:rPr>
-          <w:b/>
-        </w:rPr>
-        <w:t>## БАЗА ЗНАНИЙ: Название причины обращения (ПОЛНАЯ ВЕРСИЯ)</w:t>
+        <w:t>##  : азвание причины (Я СЯ)</w:t>
       </w:r>
     </w:p>
     <w:p/>
     <w:p>
       <w:r>
-        <w:rPr>
-          <w:b/>
-        </w:rPr>
-        <w:t>### Раздел: Маркеры классификации</w:t>
+        <w:t>### аздел: аркеры классификации</w:t>
+      </w:r>
+    </w:p>
+    <w:p/>
+    <w:p>
+      <w:r>
+        <w:t>#### лаголы-маркеры</w:t>
       </w:r>
     </w:p>
     <w:p>
       <w:r>
-        <w:rPr>
-          <w:b/>
-        </w:rPr>
-        <w:t>#### Глаголы-маркеры</w:t>
+        <w:t>- глагол1</w:t>
       </w:r>
     </w:p>
     <w:p>
       <w:r>
-        <w:t>- глагол1, глагол2</w:t>
+        <w:t>- глагол2</w:t>
       </w:r>
     </w:p>
+    <w:p/>
     <w:p>
       <w:r>
-        <w:t>- глагол3</w:t>
-      </w:r>
-    </w:p>
-    <w:p>
-      <w:r>
-        <w:rPr>
-          <w:b/>
-        </w:rPr>
         <w:t>#### Существительные-маркеры</w:t>
       </w:r>
     </w:p>
     <w:p>
       <w:r>
-        <w:t>- существительное1, существительное2</w:t>
+        <w:t>- существительное1</w:t>
       </w:r>
     </w:p>
     <w:p>
       <w:r>
-        <w:rPr>
-          <w:b/>
-        </w:rPr>
-        <w:t>#### Числовые теги</w:t>
+        <w:t>- существительное2</w:t>
+      </w:r>
+    </w:p>
+    <w:p/>
+    <w:p>
+      <w:r>
+        <w:t>#### исловые теги</w:t>
       </w:r>
     </w:p>
     <w:p>
       <w:r>
-        <w:t>- 11, 52, 552</w:t>
+        <w:t>- тег1</w:t>
+      </w:r>
+    </w:p>
+    <w:p/>
+    <w:p>
+      <w:r>
+        <w:t>#### разовые маски (100%-маркеры)</w:t>
       </w:r>
     </w:p>
     <w:p>
       <w:r>
-        <w:rPr>
-          <w:b/>
-        </w:rPr>
-        <w:t>#### Фразовые маски (100%-маркеры)</w:t>
+        <w:t>- фраза1</w:t>
       </w:r>
     </w:p>
-    <w:p>
-      <w:r>
-        <w:t>- точная фраза пользователя</w:t>
-      </w:r>
-    </w:p>
-    <w:p>
-      <w:r>
-        <w:t>- ещё одна точная фраза</w:t>
-      </w:r>
-    </w:p>
+    <w:p/>
     <w:p>
       <w:r>
         <w:t>---</w:t>
       </w:r>
     </w:p>
+    <w:p/>
     <w:p>
       <w:r>
-        <w:rPr>
-          <w:b/>
-        </w:rPr>
-        <w:t>### Раздел 1. Название тематического раздела</w:t>
+        <w:t>### аздел 1. азвание тематического раздела</w:t>
       </w:r>
     </w:p>
     <w:p/>
     <w:p>
       <w:r>
-        <w:t>**Вопрос 1. Текст вопроса пользователя?**</w:t>
+        <w:t>**опрос 1. Текст вопроса?**</w:t>
       </w:r>
     </w:p>
+    <w:p/>
     <w:p>
       <w:r>
-        <w:t>**Ответ:** Текст ответа техподдержки. Можно использовать нумерованные шаги:</w:t>
+        <w:t>**твет:** Текст ответа.</w:t>
       </w:r>
     </w:p>
-    <w:p>
-      <w:r>
-        <w:t>1. Первый шаг</w:t>
-      </w:r>
-    </w:p>
-    <w:p>
-      <w:r>
-        <w:t>2. Второй шаг</w:t>
-      </w:r>
-    </w:p>
-    <w:p>
-      <w:r>
-        <w:t>3. Третий шаг</w:t>
-      </w:r>
-    </w:p>
+    <w:p/>
     <w:p>
       <w:r>
         <w:t>---</w:t>
       </w:r>
     </w:p>
+    <w:p/>
     <w:p>
       <w:r>
-        <w:t>**Вопрос 2. Ещё один вопрос?**</w:t>
+        <w:t>### аздел: скалация на специалиста</w:t>
       </w:r>
     </w:p>
+    <w:p/>
     <w:p>
       <w:r>
-        <w:t>**Ответ:** Ответ на второй вопрос.</w:t>
-      </w:r>
-    </w:p>
-    <w:p>
-      <w:r>
-        <w:t>---</w:t>
-      </w:r>
-    </w:p>
-    <w:p>
-      <w:r>
-        <w:rPr>
-          <w:b/>
-        </w:rPr>
-        <w:t>### Раздел 2. Второй тематический раздел</w:t>
-      </w:r>
-    </w:p>
-    <w:p>
-      <w:r>
-        <w:t>**Вопрос 1. Вопрос из второго раздела?**</w:t>
-      </w:r>
-    </w:p>
-    <w:p>
-      <w:r>
-        <w:t>**Ответ:** Ответ на вопрос из второго раздела.</w:t>
-      </w:r>
-    </w:p>
-    <w:p>
-      <w:r>
-        <w:t>---</w:t>
-      </w:r>
-    </w:p>
-    <w:p>
-      <w:r>
-        <w:rPr>
-          <w:b/>
-        </w:rPr>
-        <w:t>### Раздел: Эскалация на специалиста</w:t>
-      </w:r>
-    </w:p>
-    <w:p>
-      <w:r>
-        <w:t>| Ситуация | Признаки | Действие |</w:t>
+        <w:t>| Ситуация | ризнаки | ействие |</w:t>
       </w:r>
     </w:p>
     <w:p>
@@ -183,30 +116,25 @@
     </w:p>
     <w:p>
       <w:r>
-        <w:t>| Пользователь не может войти в систему | Многократные попытки, блокировка | Передать специалисту L2 |</w:t>
+        <w:t>| писание ситуации | ризнаки проблемы | екомендуемое действие |</w:t>
       </w:r>
     </w:p>
-    <w:p>
-      <w:r>
-        <w:t>| Потеря данных | Файлы не открываются, пустая база | Немедленная эскалация L3 |</w:t>
-      </w:r>
-    </w:p>
+    <w:p/>
     <w:p>
       <w:r>
         <w:t>---</w:t>
       </w:r>
     </w:p>
+    <w:p/>
     <w:p>
       <w:r>
-        <w:rPr>
-          <w:b/>
-        </w:rPr>
-        <w:t>### Раздел: Готовые ответы</w:t>
+        <w:t>### аздел: отовые ответы</w:t>
       </w:r>
     </w:p>
+    <w:p/>
     <w:p>
       <w:r>
-        <w:t>| Вопрос пользователя | Идеальный ответ |</w:t>
+        <w:t>| опрос пользователя | деальный ответ |</w:t>
       </w:r>
     </w:p>
     <w:p>
@@ -216,12 +144,56 @@
     </w:p>
     <w:p>
       <w:r>
-        <w:t>| Как сделать X? | Для выполнения X: 1) откройте меню, 2) выберите пункт Y, 3) нажмите Z |</w:t>
+        <w:t>| ример вопроса | ример идеального ответа |</w:t>
+      </w:r>
+    </w:p>
+    <w:p/>
+    <w:p>
+      <w:r>
+        <w:t>---</w:t>
+      </w:r>
+    </w:p>
+    <w:p/>
+    <w:p>
+      <w:r>
+        <w:t>### аздел: равила 100%-эскалации (L1.5)</w:t>
       </w:r>
     </w:p>
     <w:p>
       <w:r>
-        <w:t>| Почему не работает Y? | Проверьте настройки в разделе Z. Если проблема сохраняется, перезапустите программу. |</w:t>
+        <w:t>**Статус:** ыключено</w:t>
+      </w:r>
+    </w:p>
+    <w:p>
+      <w:r>
+        <w:t>**орог совпадения:** 0.7</w:t>
+      </w:r>
+    </w:p>
+    <w:p/>
+    <w:p>
+      <w:r>
+        <w:t>#### лючевые фразы</w:t>
+      </w:r>
+    </w:p>
+    <w:p>
+      <w:r>
+        <w:t xml:space="preserve">- </w:t>
+      </w:r>
+    </w:p>
+    <w:p/>
+    <w:p>
+      <w:r>
+        <w:t>#### ары вопрос-ответ для эскалации</w:t>
+      </w:r>
+    </w:p>
+    <w:p>
+      <w:r>
+        <w:t>| опрос | твет |</w:t>
+      </w:r>
+    </w:p>
+    <w:p>
+      <w:r>
+        <w:t>| :--- | :--- |</w:t>
       </w:r>
     </w:p>
     <w:sectPr>

</xml_diff>